<commit_message>
Update CV, add .docx version
</commit_message>
<xml_diff>
--- a/assets/Artem_Shishkin_CV.docx
+++ b/assets/Artem_Shishkin_CV.docx
@@ -94,14 +94,7 @@
           <w:color w:val="1C525B" w:themeColor="accent1" w:themeShade="80"/>
           <w:lang w:val="en-US" w:bidi="ru-RU"/>
         </w:rPr>
-        <w:t>Automation</w:t>
-      </w:r>
-      <w:r>
-        <w:rPr>
-          <w:color w:val="1C525B" w:themeColor="accent1" w:themeShade="80"/>
-          <w:lang w:val="en-US" w:bidi="ru-RU"/>
-        </w:rPr>
-        <w:t xml:space="preserve"> Engineer</w:t>
+        <w:t>Python Developer</w:t>
       </w:r>
     </w:p>
     <w:p>
@@ -490,7 +483,7 @@
         <w:rPr>
           <w:lang w:val="en-US" w:bidi="ru-RU"/>
         </w:rPr>
-        <w:t>Focused on solving business problems by building automation workflows and integrations with multiple systems - including LLMs - for automating internal processes and repetitive tasks.</w:t>
+        <w:t>Focused on solving business problems by designing and building automation workflows and system integrations, including solutions powered by LLMs and AI agents, to streamline internal processes and reduce manual effort.</w:t>
       </w:r>
     </w:p>
     <w:p>
@@ -504,7 +497,19 @@
         <w:rPr>
           <w:lang w:val="en-US" w:bidi="ru-RU"/>
         </w:rPr>
-        <w:t>Actively explore AI tools and apply them both during development and in working production apps. Experienced in prompt engineering and the RAG-based approach.</w:t>
+        <w:t xml:space="preserve">Actively leverage AI tools both in development workflows and in production systems. Experienced in prompt </w:t>
+      </w:r>
+      <w:r>
+        <w:rPr>
+          <w:lang w:val="en-US" w:bidi="ru-RU"/>
+        </w:rPr>
+        <w:t xml:space="preserve">and context </w:t>
+      </w:r>
+      <w:r>
+        <w:rPr>
+          <w:lang w:val="en-US" w:bidi="ru-RU"/>
+        </w:rPr>
+        <w:t>engineering and RAG-based architectures, going beyond simple API integrations to build more advanced, agent-like solutions.</w:t>
       </w:r>
     </w:p>
     <w:p>
@@ -514,57 +519,25 @@
           <w:lang w:val="en-US" w:bidi="ru-RU"/>
         </w:rPr>
       </w:pPr>
-      <w:proofErr w:type="gramStart"/>
-      <w:r>
-        <w:rPr>
-          <w:lang w:val="en-US" w:bidi="ru-RU"/>
-        </w:rPr>
-        <w:t>Also</w:t>
-      </w:r>
-      <w:proofErr w:type="gramEnd"/>
-      <w:r>
-        <w:rPr>
-          <w:lang w:val="en-US" w:bidi="ru-RU"/>
-        </w:rPr>
-        <w:t xml:space="preserve"> s</w:t>
-      </w:r>
-      <w:r>
-        <w:rPr>
-          <w:lang w:val="en-US" w:bidi="ru-RU"/>
-        </w:rPr>
-        <w:t>trong background in monitoring, log and data analysis, troubleshooting, with hands-on experience in DevOps practices and SRE (e.g. CI/CD pipelines, Docker).</w:t>
-      </w:r>
-    </w:p>
-    <w:p>
-      <w:pPr>
-        <w:spacing w:after="0" w:line="216" w:lineRule="auto"/>
-        <w:rPr>
-          <w:lang w:val="en-US" w:bidi="ru-RU"/>
-        </w:rPr>
-      </w:pPr>
-      <w:r>
-        <w:rPr>
-          <w:lang w:val="en-US" w:bidi="ru-RU"/>
-        </w:rPr>
-        <w:t>Self-learned, highly motivated, passionate about hands-on experience and continuous learning of new tools and technologies.</w:t>
-      </w:r>
-      <w:r>
-        <w:rPr>
-          <w:lang w:val="en-US" w:bidi="ru-RU"/>
-        </w:rPr>
-        <w:t xml:space="preserve"> </w:t>
-      </w:r>
-      <w:r>
-        <w:rPr>
-          <w:lang w:val="en-US" w:bidi="ru-RU"/>
-        </w:rPr>
-        <w:t>Results-oriented and focused on customer satisfaction</w:t>
-      </w:r>
-      <w:r>
-        <w:rPr>
-          <w:lang w:val="en-US" w:bidi="ru-RU"/>
-        </w:rPr>
-        <w:t>.</w:t>
+      <w:r>
+        <w:rPr>
+          <w:lang w:val="en-US" w:bidi="ru-RU"/>
+        </w:rPr>
+        <w:t>Strong background in monitoring, log and data analysis, and troubleshooting, combined with hands-on experience in DevOps and SRE practices (CI/CD, Docker, production support).</w:t>
+      </w:r>
+    </w:p>
+    <w:p>
+      <w:pPr>
+        <w:spacing w:after="60" w:line="216" w:lineRule="auto"/>
+        <w:rPr>
+          <w:lang w:val="en-US" w:bidi="ru-RU"/>
+        </w:rPr>
+      </w:pPr>
+      <w:r>
+        <w:rPr>
+          <w:lang w:val="en-US" w:bidi="ru-RU"/>
+        </w:rPr>
+        <w:t>Self-taught, highly motivated, and results-oriented engineer with a strong ownership mindset. Comfortable working autonomously and driving tasks end-to-end — from problem definition and system design to implementation and production deployment.</w:t>
       </w:r>
     </w:p>
     <w:p>
@@ -654,6 +627,20 @@
         <w:rPr>
           <w:lang w:val="en-US" w:eastAsia="ru-RU"/>
         </w:rPr>
+        <w:t>asyncio</w:t>
+      </w:r>
+      <w:proofErr w:type="spellEnd"/>
+      <w:r>
+        <w:rPr>
+          <w:lang w:val="en-US" w:eastAsia="ru-RU"/>
+        </w:rPr>
+        <w:t xml:space="preserve">, </w:t>
+      </w:r>
+      <w:proofErr w:type="spellStart"/>
+      <w:r>
+        <w:rPr>
+          <w:lang w:val="en-US" w:eastAsia="ru-RU"/>
+        </w:rPr>
         <w:t>FastAPI</w:t>
       </w:r>
       <w:proofErr w:type="spellEnd"/>
@@ -661,136 +648,48 @@
         <w:rPr>
           <w:lang w:val="en-US" w:eastAsia="ru-RU"/>
         </w:rPr>
-        <w:t xml:space="preserve">, Flask, </w:t>
+        <w:t xml:space="preserve">, </w:t>
       </w:r>
       <w:proofErr w:type="spellStart"/>
       <w:r>
         <w:rPr>
           <w:lang w:val="en-US" w:eastAsia="ru-RU"/>
         </w:rPr>
-        <w:t>uv</w:t>
+        <w:t>h</w:t>
+      </w:r>
+      <w:r>
+        <w:rPr>
+          <w:lang w:val="en-US" w:eastAsia="ru-RU"/>
+        </w:rPr>
+        <w:t>ttpx</w:t>
       </w:r>
       <w:proofErr w:type="spellEnd"/>
       <w:r>
         <w:rPr>
           <w:lang w:val="en-US" w:eastAsia="ru-RU"/>
         </w:rPr>
-        <w:t xml:space="preserve">, </w:t>
+        <w:t>,</w:t>
+      </w:r>
+      <w:r>
+        <w:rPr>
+          <w:lang w:val="en-US" w:eastAsia="ru-RU"/>
+        </w:rPr>
+        <w:t xml:space="preserve"> </w:t>
       </w:r>
       <w:proofErr w:type="spellStart"/>
       <w:r>
         <w:rPr>
           <w:lang w:val="en-US" w:eastAsia="ru-RU"/>
         </w:rPr>
-        <w:t>h</w:t>
-      </w:r>
-      <w:r>
-        <w:rPr>
-          <w:lang w:val="en-US" w:eastAsia="ru-RU"/>
-        </w:rPr>
-        <w:t>ttpx</w:t>
+        <w:t>p</w:t>
+      </w:r>
+      <w:r>
+        <w:rPr>
+          <w:lang w:val="en-US" w:eastAsia="ru-RU"/>
+        </w:rPr>
+        <w:t>ydantic</w:t>
       </w:r>
       <w:proofErr w:type="spellEnd"/>
-      <w:r>
-        <w:rPr>
-          <w:lang w:val="en-US" w:eastAsia="ru-RU"/>
-        </w:rPr>
-        <w:t>,</w:t>
-      </w:r>
-      <w:r>
-        <w:rPr>
-          <w:lang w:val="en-US" w:eastAsia="ru-RU"/>
-        </w:rPr>
-        <w:t xml:space="preserve"> </w:t>
-      </w:r>
-      <w:proofErr w:type="spellStart"/>
-      <w:r>
-        <w:rPr>
-          <w:lang w:val="en-US" w:eastAsia="ru-RU"/>
-        </w:rPr>
-        <w:t>a</w:t>
-      </w:r>
-      <w:r>
-        <w:rPr>
-          <w:lang w:val="en-US" w:eastAsia="ru-RU"/>
-        </w:rPr>
-        <w:t>syncio</w:t>
-      </w:r>
-      <w:proofErr w:type="spellEnd"/>
-      <w:r>
-        <w:rPr>
-          <w:lang w:val="en-US" w:eastAsia="ru-RU"/>
-        </w:rPr>
-        <w:t>,</w:t>
-      </w:r>
-      <w:r>
-        <w:rPr>
-          <w:lang w:val="en-US" w:eastAsia="ru-RU"/>
-        </w:rPr>
-        <w:t xml:space="preserve"> </w:t>
-      </w:r>
-      <w:proofErr w:type="spellStart"/>
-      <w:r>
-        <w:rPr>
-          <w:lang w:val="en-US" w:eastAsia="ru-RU"/>
-        </w:rPr>
-        <w:t>p</w:t>
-      </w:r>
-      <w:r>
-        <w:rPr>
-          <w:lang w:val="en-US" w:eastAsia="ru-RU"/>
-        </w:rPr>
-        <w:t>ydantic</w:t>
-      </w:r>
-      <w:proofErr w:type="spellEnd"/>
-      <w:r>
-        <w:rPr>
-          <w:lang w:val="en-US" w:eastAsia="ru-RU"/>
-        </w:rPr>
-        <w:t>,</w:t>
-      </w:r>
-      <w:r>
-        <w:rPr>
-          <w:lang w:val="en-US" w:eastAsia="ru-RU"/>
-        </w:rPr>
-        <w:t xml:space="preserve"> </w:t>
-      </w:r>
-      <w:r>
-        <w:rPr>
-          <w:lang w:val="en-US" w:eastAsia="ru-RU"/>
-        </w:rPr>
-        <w:t>p</w:t>
-      </w:r>
-      <w:r>
-        <w:rPr>
-          <w:lang w:val="en-US" w:eastAsia="ru-RU"/>
-        </w:rPr>
-        <w:t xml:space="preserve">andas, </w:t>
-      </w:r>
-      <w:r>
-        <w:rPr>
-          <w:lang w:val="en-US" w:eastAsia="ru-RU"/>
-        </w:rPr>
-        <w:t>m</w:t>
-      </w:r>
-      <w:r>
-        <w:rPr>
-          <w:lang w:val="en-US" w:eastAsia="ru-RU"/>
-        </w:rPr>
-        <w:t>atplotlib</w:t>
-      </w:r>
-      <w:r>
-        <w:rPr>
-          <w:lang w:val="en-US" w:eastAsia="ru-RU"/>
-        </w:rPr>
-        <w:t>, t</w:t>
-      </w:r>
-      <w:r>
-        <w:rPr>
-          <w:lang w:val="en-US" w:eastAsia="ru-RU"/>
-        </w:rPr>
-        <w:t xml:space="preserve">esseract </w:t>
-      </w:r>
     </w:p>
     <w:p>
       <w:pPr>
@@ -812,8 +711,42 @@
         <w:rPr>
           <w:lang w:val="en-US" w:eastAsia="ru-RU"/>
         </w:rPr>
-        <w:t>: RAG, LLM’s API</w:t>
-      </w:r>
+        <w:t xml:space="preserve">: RAG, </w:t>
+      </w:r>
+      <w:r>
+        <w:rPr>
+          <w:lang w:val="en-US" w:eastAsia="ru-RU"/>
+        </w:rPr>
+        <w:t>OpenAI</w:t>
+      </w:r>
+      <w:r>
+        <w:rPr>
+          <w:lang w:val="en-US" w:eastAsia="ru-RU"/>
+        </w:rPr>
+        <w:t>-</w:t>
+      </w:r>
+      <w:proofErr w:type="spellStart"/>
+      <w:r>
+        <w:rPr>
+          <w:lang w:val="en-US" w:eastAsia="ru-RU"/>
+        </w:rPr>
+        <w:t>comptible</w:t>
+      </w:r>
+      <w:proofErr w:type="spellEnd"/>
+      <w:r>
+        <w:rPr>
+          <w:lang w:val="en-US" w:eastAsia="ru-RU"/>
+        </w:rPr>
+        <w:t xml:space="preserve"> REST API, </w:t>
+      </w:r>
+      <w:proofErr w:type="spellStart"/>
+      <w:r>
+        <w:rPr>
+          <w:lang w:val="en-US" w:eastAsia="ru-RU"/>
+        </w:rPr>
+        <w:t>LangChain</w:t>
+      </w:r>
+      <w:proofErr w:type="spellEnd"/>
       <w:r>
         <w:rPr>
           <w:lang w:val="en-US" w:eastAsia="ru-RU"/>
@@ -825,7 +758,21 @@
         <w:rPr>
           <w:lang w:val="en-US" w:eastAsia="ru-RU"/>
         </w:rPr>
-        <w:t>LangChain</w:t>
+        <w:t>LangGraph</w:t>
+      </w:r>
+      <w:proofErr w:type="spellEnd"/>
+      <w:r>
+        <w:rPr>
+          <w:lang w:val="en-US" w:eastAsia="ru-RU"/>
+        </w:rPr>
+        <w:t xml:space="preserve">, </w:t>
+      </w:r>
+      <w:proofErr w:type="spellStart"/>
+      <w:r>
+        <w:rPr>
+          <w:lang w:val="en-US" w:eastAsia="ru-RU"/>
+        </w:rPr>
+        <w:t>OpenCode</w:t>
       </w:r>
       <w:proofErr w:type="spellEnd"/>
     </w:p>
@@ -849,7 +796,7 @@
         <w:rPr>
           <w:lang w:val="en-US" w:eastAsia="ru-RU"/>
         </w:rPr>
-        <w:t>: PostgreSQL, Redis, MongoDB</w:t>
+        <w:t>: PostgreSQL, Redis</w:t>
       </w:r>
     </w:p>
     <w:p>
@@ -888,21 +835,25 @@
         <w:rPr>
           <w:lang w:val="en-US" w:eastAsia="ru-RU"/>
         </w:rPr>
-        <w:t xml:space="preserve">, Docker, GitLab CI, </w:t>
-      </w:r>
-      <w:proofErr w:type="spellStart"/>
-      <w:r>
-        <w:rPr>
-          <w:lang w:val="en-US" w:eastAsia="ru-RU"/>
-        </w:rPr>
-        <w:t>cUrl</w:t>
-      </w:r>
-      <w:proofErr w:type="spellEnd"/>
-      <w:r>
-        <w:rPr>
-          <w:lang w:val="en-US" w:eastAsia="ru-RU"/>
-        </w:rPr>
-        <w:t xml:space="preserve">, K8s </w:t>
+        <w:t>, Docker, GitLab CI,</w:t>
+      </w:r>
+      <w:r>
+        <w:rPr>
+          <w:lang w:val="en-US" w:eastAsia="ru-RU"/>
+        </w:rPr>
+        <w:t xml:space="preserve"> K8s </w:t>
+      </w:r>
+      <w:r>
+        <w:rPr>
+          <w:lang w:val="en-US" w:eastAsia="ru-RU"/>
+        </w:rPr>
+        <w:t>&amp; Rancher</w:t>
+      </w:r>
+      <w:r>
+        <w:rPr>
+          <w:lang w:val="en-US" w:eastAsia="ru-RU"/>
+        </w:rPr>
+        <w:t xml:space="preserve"> </w:t>
       </w:r>
       <w:r>
         <w:rPr>
@@ -914,51 +865,13 @@
         <w:rPr>
           <w:lang w:val="en-US" w:eastAsia="ru-RU"/>
         </w:rPr>
-        <w:t xml:space="preserve"> &amp; </w:t>
-      </w:r>
-      <w:r>
-        <w:rPr>
-          <w:lang w:val="en-US" w:eastAsia="ru-RU"/>
-        </w:rPr>
-        <w:t xml:space="preserve">Helm Values, </w:t>
-      </w:r>
-      <w:r>
-        <w:rPr>
-          <w:lang w:val="en-US" w:eastAsia="ru-RU"/>
-        </w:rPr>
-        <w:t xml:space="preserve">Rancher, </w:t>
-      </w:r>
-      <w:r>
-        <w:rPr>
-          <w:lang w:val="en-US" w:eastAsia="ru-RU"/>
-        </w:rPr>
-        <w:t>Keycloak</w:t>
-      </w:r>
-      <w:r>
-        <w:rPr>
-          <w:lang w:val="en-US" w:eastAsia="ru-RU"/>
-        </w:rPr>
-        <w:t xml:space="preserve">, </w:t>
-      </w:r>
-      <w:proofErr w:type="spellStart"/>
-      <w:r>
-        <w:rPr>
-          <w:lang w:val="en-US" w:eastAsia="ru-RU"/>
-        </w:rPr>
-        <w:t>HashiCorp</w:t>
-      </w:r>
-      <w:proofErr w:type="spellEnd"/>
-      <w:r>
-        <w:rPr>
-          <w:lang w:val="en-US" w:eastAsia="ru-RU"/>
-        </w:rPr>
-        <w:t xml:space="preserve"> Vault</w:t>
-      </w:r>
-      <w:r>
-        <w:rPr>
-          <w:lang w:val="en-US" w:eastAsia="ru-RU"/>
-        </w:rPr>
-        <w:t>, Networks</w:t>
+        <w:t xml:space="preserve">s, </w:t>
+      </w:r>
+      <w:r>
+        <w:rPr>
+          <w:lang w:val="en-US" w:eastAsia="ru-RU"/>
+        </w:rPr>
+        <w:t>Helm Values</w:t>
       </w:r>
       <w:r>
         <w:rPr>
@@ -998,56 +911,7 @@
         <w:rPr>
           <w:lang w:val="en-US" w:eastAsia="ru-RU"/>
         </w:rPr>
-        <w:t xml:space="preserve">Grafana, </w:t>
-      </w:r>
-      <w:r>
-        <w:rPr>
-          <w:lang w:val="en-US" w:eastAsia="ru-RU"/>
-        </w:rPr>
-        <w:t>Prometheus</w:t>
-      </w:r>
-      <w:r>
-        <w:rPr>
-          <w:lang w:val="en-US" w:eastAsia="ru-RU"/>
-        </w:rPr>
-        <w:t xml:space="preserve">, ELK, </w:t>
-      </w:r>
-      <w:proofErr w:type="spellStart"/>
-      <w:r>
-        <w:rPr>
-          <w:lang w:val="en-US" w:eastAsia="ru-RU"/>
-        </w:rPr>
-        <w:t>VictoriaMetrics</w:t>
-      </w:r>
-      <w:proofErr w:type="spellEnd"/>
-      <w:r>
-        <w:rPr>
-          <w:lang w:val="en-US" w:eastAsia="ru-RU"/>
-        </w:rPr>
-        <w:t>, Vector</w:t>
-      </w:r>
-    </w:p>
-    <w:p>
-      <w:pPr>
-        <w:pStyle w:val="a"/>
-        <w:spacing w:line="276" w:lineRule="auto"/>
-        <w:rPr>
-          <w:lang w:val="en-US" w:bidi="ru-RU"/>
-        </w:rPr>
-      </w:pPr>
-      <w:r>
-        <w:rPr>
-          <w:b/>
-          <w:bCs/>
-          <w:lang w:val="en-US" w:eastAsia="ru-RU"/>
-        </w:rPr>
-        <w:t>Frontend</w:t>
-      </w:r>
-      <w:r>
-        <w:rPr>
-          <w:lang w:val="en-US" w:eastAsia="ru-RU"/>
-        </w:rPr>
-        <w:t>: HTML, CSS, JavaScript</w:t>
+        <w:t>Grafana</w:t>
       </w:r>
     </w:p>
     <w:p>
@@ -1065,7 +929,15 @@
           <w:bCs/>
           <w:lang w:val="en-US" w:eastAsia="ru-RU"/>
         </w:rPr>
-        <w:t>Other tools</w:t>
+        <w:t>Other</w:t>
+      </w:r>
+      <w:r>
+        <w:rPr>
+          <w:b/>
+          <w:bCs/>
+          <w:lang w:val="en-US" w:eastAsia="ru-RU"/>
+        </w:rPr>
+        <w:t xml:space="preserve"> skills</w:t>
       </w:r>
       <w:r>
         <w:rPr>
@@ -1077,8 +949,78 @@
         <w:rPr>
           <w:lang w:val="en-US" w:bidi="ru-RU"/>
         </w:rPr>
-        <w:t xml:space="preserve"> N8N, Git, Jira, Confluence, Bitbucket</w:t>
-      </w:r>
+        <w:t xml:space="preserve"> N8N, Git, </w:t>
+      </w:r>
+      <w:r>
+        <w:rPr>
+          <w:lang w:val="en-US" w:bidi="ru-RU"/>
+        </w:rPr>
+        <w:t>JIRA</w:t>
+      </w:r>
+      <w:r>
+        <w:rPr>
+          <w:lang w:val="en-US" w:bidi="ru-RU"/>
+        </w:rPr>
+        <w:t>, Confluence</w:t>
+      </w:r>
+      <w:r>
+        <w:rPr>
+          <w:lang w:val="en-US" w:bidi="ru-RU"/>
+        </w:rPr>
+        <w:t xml:space="preserve">, </w:t>
+      </w:r>
+      <w:r>
+        <w:rPr>
+          <w:lang w:val="en-US" w:bidi="ru-RU"/>
+        </w:rPr>
+        <w:t>OAuth 2.0</w:t>
+      </w:r>
+      <w:r>
+        <w:rPr>
+          <w:lang w:val="en-US" w:bidi="ru-RU"/>
+        </w:rPr>
+        <w:t xml:space="preserve">, </w:t>
+      </w:r>
+      <w:r>
+        <w:rPr>
+          <w:lang w:val="en-US" w:eastAsia="ru-RU"/>
+        </w:rPr>
+        <w:t>Keycloak</w:t>
+      </w:r>
+      <w:r>
+        <w:rPr>
+          <w:lang w:val="en-US" w:eastAsia="ru-RU"/>
+        </w:rPr>
+        <w:t xml:space="preserve">, </w:t>
+      </w:r>
+      <w:proofErr w:type="spellStart"/>
+      <w:r>
+        <w:rPr>
+          <w:lang w:val="en-US" w:eastAsia="ru-RU"/>
+        </w:rPr>
+        <w:t>HashiCorp</w:t>
+      </w:r>
+      <w:proofErr w:type="spellEnd"/>
+      <w:r>
+        <w:rPr>
+          <w:lang w:val="en-US" w:eastAsia="ru-RU"/>
+        </w:rPr>
+        <w:t xml:space="preserve"> Vault</w:t>
+      </w:r>
+      <w:r>
+        <w:rPr>
+          <w:lang w:val="en-US" w:eastAsia="ru-RU"/>
+        </w:rPr>
+        <w:t xml:space="preserve">, </w:t>
+      </w:r>
+      <w:proofErr w:type="spellStart"/>
+      <w:r>
+        <w:rPr>
+          <w:lang w:val="en-US" w:eastAsia="ru-RU"/>
+        </w:rPr>
+        <w:t>cUrl</w:t>
+      </w:r>
+      <w:proofErr w:type="spellEnd"/>
     </w:p>
     <w:p>
       <w:pPr>
@@ -1357,7 +1299,19 @@
         <w:rPr>
           <w:lang w:val="en-US" w:eastAsia="ru-RU"/>
         </w:rPr>
-        <w:t>Integrated with various internal systems and services via Keycloak-based authentication</w:t>
+        <w:t xml:space="preserve">Integrated with various internal systems and services via Keycloak-based </w:t>
+      </w:r>
+      <w:r>
+        <w:rPr>
+          <w:lang w:val="en-US" w:eastAsia="ru-RU"/>
+        </w:rPr>
+        <w:t xml:space="preserve">OAuth 2.0 </w:t>
+      </w:r>
+      <w:r>
+        <w:rPr>
+          <w:lang w:val="en-US" w:eastAsia="ru-RU"/>
+        </w:rPr>
+        <w:t>authentication</w:t>
       </w:r>
     </w:p>
     <w:p>
@@ -1372,7 +1326,19 @@
         <w:rPr>
           <w:lang w:val="en-US" w:eastAsia="ru-RU"/>
         </w:rPr>
-        <w:t>Connected to internally deployed open-source LLMs and vector DB (for applying the RAG approach)</w:t>
+        <w:t>Connected to internally deployed open-source LLMs and vector DB</w:t>
+      </w:r>
+      <w:r>
+        <w:rPr>
+          <w:lang w:val="en-US" w:eastAsia="ru-RU"/>
+        </w:rPr>
+        <w:t>s</w:t>
+      </w:r>
+      <w:r>
+        <w:rPr>
+          <w:lang w:val="en-US" w:eastAsia="ru-RU"/>
+        </w:rPr>
+        <w:t xml:space="preserve"> (for applying the RAG approach)</w:t>
       </w:r>
     </w:p>
     <w:p>
@@ -1402,7 +1368,25 @@
         <w:rPr>
           <w:lang w:val="en-US" w:eastAsia="ru-RU"/>
         </w:rPr>
-        <w:t>Containerized in Docker and deployed via GitLab CI pipelines with Vault-managed secrets</w:t>
+        <w:t xml:space="preserve">Containerized in Docker and deployed via GitLab CI pipelines </w:t>
+      </w:r>
+      <w:r>
+        <w:rPr>
+          <w:lang w:val="en-US" w:eastAsia="ru-RU"/>
+        </w:rPr>
+        <w:t xml:space="preserve">to VMs and </w:t>
+      </w:r>
+      <w:r>
+        <w:rPr>
+          <w:lang w:val="en-US" w:eastAsia="ru-RU"/>
+        </w:rPr>
+        <w:t xml:space="preserve">K8s </w:t>
+      </w:r>
+      <w:r>
+        <w:rPr>
+          <w:lang w:val="en-US" w:eastAsia="ru-RU"/>
+        </w:rPr>
+        <w:t>with Vault-managed secrets</w:t>
       </w:r>
     </w:p>
     <w:p>
@@ -1721,19 +1705,11 @@
         </w:rPr>
         <w:t xml:space="preserve">, </w:t>
       </w:r>
-      <w:proofErr w:type="gramStart"/>
-      <w:r>
-        <w:rPr>
-          <w:lang w:val="en-US"/>
-        </w:rPr>
-        <w:t>On-site</w:t>
-      </w:r>
-      <w:proofErr w:type="gramEnd"/>
-      <w:r>
-        <w:rPr>
-          <w:lang w:val="en-US"/>
-        </w:rPr>
-        <w:t xml:space="preserve"> (Moscow, Russia)</w:t>
+      <w:r>
+        <w:rPr>
+          <w:lang w:val="en-US"/>
+        </w:rPr>
+        <w:t>On-site (Moscow, Russia)</w:t>
       </w:r>
       <w:r>
         <w:rPr>
@@ -2000,19 +1976,13 @@
         <w:rPr>
           <w:lang w:val="en-US"/>
         </w:rPr>
-        <w:t>Integrated into Service Desk and designed</w:t>
-      </w:r>
-      <w:r>
-        <w:rPr>
-          <w:lang w:val="en-US"/>
-        </w:rPr>
-        <w:t xml:space="preserve"> </w:t>
-      </w:r>
-      <w:r>
-        <w:rPr>
-          <w:lang w:val="en-US"/>
-        </w:rPr>
-        <w:t>to be used as a no-code AI tool by anyone in the company:</w:t>
+        <w:t>Integrated into Service Desk and designed as a no-code AI agent builder, enabling non-technical users to create custom agents for any ticket form, regardless of complexity or field structure</w:t>
+      </w:r>
+      <w:r>
+        <w:rPr>
+          <w:lang w:val="en-US"/>
+        </w:rPr>
+        <w:t>:</w:t>
       </w:r>
     </w:p>
     <w:p>
@@ -2858,13 +2828,37 @@
         <w:rPr>
           <w:lang w:val="en-US" w:eastAsia="ru-RU"/>
         </w:rPr>
-        <w:t>n8n Course Level 1</w:t>
-      </w:r>
-      <w:r>
-        <w:rPr>
-          <w:lang w:val="en-US" w:eastAsia="ru-RU"/>
-        </w:rPr>
-        <w:t xml:space="preserve"> (n8n) | </w:t>
+        <w:t>n8n Course</w:t>
+      </w:r>
+      <w:r>
+        <w:rPr>
+          <w:lang w:val="en-US" w:eastAsia="ru-RU"/>
+        </w:rPr>
+        <w:t>s</w:t>
+      </w:r>
+      <w:r>
+        <w:rPr>
+          <w:lang w:val="en-US" w:eastAsia="ru-RU"/>
+        </w:rPr>
+        <w:t xml:space="preserve"> </w:t>
+      </w:r>
+      <w:r>
+        <w:rPr>
+          <w:lang w:val="en-US" w:eastAsia="ru-RU"/>
+        </w:rPr>
+        <w:t>(</w:t>
+      </w:r>
+      <w:r>
+        <w:rPr>
+          <w:lang w:val="en-US" w:eastAsia="ru-RU"/>
+        </w:rPr>
+        <w:t>Level 1</w:t>
+      </w:r>
+      <w:r>
+        <w:rPr>
+          <w:lang w:val="en-US" w:eastAsia="ru-RU"/>
+        </w:rPr>
+        <w:t xml:space="preserve"> </w:t>
       </w:r>
       <w:hyperlink r:id="rId21" w:history="1">
         <w:r>
@@ -2881,49 +2875,19 @@
         <w:rPr>
           <w:lang w:val="en-US" w:eastAsia="ru-RU"/>
         </w:rPr>
-        <w:tab/>
-        <w:t>December 2025</w:t>
-      </w:r>
-    </w:p>
-    <w:p>
-      <w:pPr>
-        <w:pStyle w:val="a"/>
-        <w:tabs>
-          <w:tab w:val="right" w:pos="10773"/>
-        </w:tabs>
-        <w:rPr>
-          <w:lang w:val="en-US" w:eastAsia="ru-RU"/>
-        </w:rPr>
-      </w:pPr>
-      <w:r>
-        <w:rPr>
-          <w:lang w:val="en-US" w:eastAsia="ru-RU"/>
-        </w:rPr>
-        <w:t xml:space="preserve">n8n Course Level </w:t>
-      </w:r>
-      <w:r>
-        <w:rPr>
-          <w:lang w:val="en-US" w:eastAsia="ru-RU"/>
-        </w:rPr>
-        <w:t>2</w:t>
-      </w:r>
-      <w:r>
-        <w:rPr>
-          <w:lang w:val="en-US" w:eastAsia="ru-RU"/>
-        </w:rPr>
-        <w:t xml:space="preserve"> </w:t>
-      </w:r>
-      <w:r>
-        <w:rPr>
-          <w:lang w:val="en-US" w:eastAsia="ru-RU"/>
-        </w:rPr>
-        <w:t xml:space="preserve">(n8n) </w:t>
-      </w:r>
-      <w:r>
-        <w:rPr>
-          <w:lang w:val="en-US" w:eastAsia="ru-RU"/>
-        </w:rPr>
-        <w:t xml:space="preserve">| </w:t>
+        <w:t xml:space="preserve">, </w:t>
+      </w:r>
+      <w:r>
+        <w:rPr>
+          <w:lang w:val="en-US" w:eastAsia="ru-RU"/>
+        </w:rPr>
+        <w:t xml:space="preserve">Level </w:t>
+      </w:r>
+      <w:r>
+        <w:rPr>
+          <w:lang w:val="en-US" w:eastAsia="ru-RU"/>
+        </w:rPr>
+        <w:t xml:space="preserve">2 </w:t>
       </w:r>
       <w:hyperlink r:id="rId22" w:history="1">
         <w:r>
@@ -2938,14 +2902,15 @@
       </w:hyperlink>
       <w:r>
         <w:rPr>
+          <w:lang w:val="en-US"/>
+        </w:rPr>
+        <w:t>)</w:t>
+      </w:r>
+      <w:r>
+        <w:rPr>
           <w:lang w:val="en-US" w:eastAsia="ru-RU"/>
         </w:rPr>
         <w:tab/>
-      </w:r>
-      <w:r>
-        <w:rPr>
-          <w:lang w:val="en-US" w:eastAsia="ru-RU"/>
-        </w:rPr>
         <w:t>December 2025</w:t>
       </w:r>
     </w:p>
@@ -3151,19 +3116,11 @@
         </w:rPr>
         <w:t xml:space="preserve">, </w:t>
       </w:r>
-      <w:proofErr w:type="gramStart"/>
-      <w:r>
-        <w:rPr>
-          <w:lang w:val="en-US"/>
-        </w:rPr>
-        <w:t>On-site</w:t>
-      </w:r>
-      <w:proofErr w:type="gramEnd"/>
-      <w:r>
-        <w:rPr>
-          <w:lang w:val="en-US"/>
-        </w:rPr>
-        <w:t xml:space="preserve"> (Moscow, Russia)</w:t>
+      <w:r>
+        <w:rPr>
+          <w:lang w:val="en-US"/>
+        </w:rPr>
+        <w:t>On-site (Moscow, Russia)</w:t>
       </w:r>
       <w:r>
         <w:rPr>
@@ -3456,7 +3413,7 @@
   <w:abstractNum w:abstractNumId="9" w15:restartNumberingAfterBreak="0">
     <w:nsid w:val="FFFFFF89"/>
     <w:multiLevelType w:val="singleLevel"/>
-    <w:tmpl w:val="6FA696E4"/>
+    <w:tmpl w:val="7DF47098"/>
     <w:lvl w:ilvl="0">
       <w:start w:val="1"/>
       <w:numFmt w:val="bullet"/>
@@ -7225,6 +7182,15 @@
 </file>
 
 <file path=customXml/item1.xml><?xml version="1.0" encoding="utf-8"?>
+<p:properties xmlns:p="http://schemas.microsoft.com/office/2006/metadata/properties" xmlns:xsi="http://www.w3.org/2001/XMLSchema-instance" xmlns:pc="http://schemas.microsoft.com/office/infopath/2007/PartnerControls">
+  <documentManagement>
+    <Status xmlns="71af3243-3dd4-4a8d-8c0d-dd76da1f02a5">Not started</Status>
+    <MediaServiceKeyPoints xmlns="71af3243-3dd4-4a8d-8c0d-dd76da1f02a5" xsi:nil="true"/>
+  </documentManagement>
+</p:properties>
+</file>
+
+<file path=customXml/item2.xml><?xml version="1.0" encoding="utf-8"?>
 <?mso-contentType ?>
 <FormTemplates xmlns="http://schemas.microsoft.com/sharepoint/v3/contenttype/forms">
   <Display>DocumentLibraryForm</Display>
@@ -7233,16 +7199,11 @@
 </FormTemplates>
 </file>
 
-<file path=customXml/item2.xml><?xml version="1.0" encoding="utf-8"?>
-<p:properties xmlns:p="http://schemas.microsoft.com/office/2006/metadata/properties" xmlns:xsi="http://www.w3.org/2001/XMLSchema-instance" xmlns:pc="http://schemas.microsoft.com/office/infopath/2007/PartnerControls">
-  <documentManagement>
-    <Status xmlns="71af3243-3dd4-4a8d-8c0d-dd76da1f02a5">Not started</Status>
-    <MediaServiceKeyPoints xmlns="71af3243-3dd4-4a8d-8c0d-dd76da1f02a5" xsi:nil="true"/>
-  </documentManagement>
-</p:properties>
+<file path=customXml/item3.xml><?xml version="1.0" encoding="utf-8"?>
+<b:Sources xmlns:b="http://schemas.openxmlformats.org/officeDocument/2006/bibliography" xmlns="http://schemas.openxmlformats.org/officeDocument/2006/bibliography" SelectedStyle="\APASixthEditionOfficeOnline.xsl" StyleName="APA" Version="6"/>
 </file>
 
-<file path=customXml/item3.xml><?xml version="1.0" encoding="utf-8"?>
+<file path=customXml/item4.xml><?xml version="1.0" encoding="utf-8"?>
 <ct:contentTypeSchema xmlns:ct="http://schemas.microsoft.com/office/2006/metadata/contentType" xmlns:ma="http://schemas.microsoft.com/office/2006/metadata/properties/metaAttributes" ct:_="" ma:_="" ma:contentTypeName="Document" ma:contentTypeID="0x01010079F111ED35F8CC479449609E8A0923A6" ma:contentTypeVersion="12" ma:contentTypeDescription="Create a new document." ma:contentTypeScope="" ma:versionID="7e3f163ba23981de9af4e94a4fc3c170">
   <xsd:schema xmlns:xsd="http://www.w3.org/2001/XMLSchema" xmlns:xs="http://www.w3.org/2001/XMLSchema" xmlns:p="http://schemas.microsoft.com/office/2006/metadata/properties" xmlns:ns2="71af3243-3dd4-4a8d-8c0d-dd76da1f02a5" xmlns:ns3="16c05727-aa75-4e4a-9b5f-8a80a1165891" targetNamespace="http://schemas.microsoft.com/office/2006/metadata/properties" ma:root="true" ma:fieldsID="77303e74caa42b09a8f0afd286949429" ns2:_="" ns3:_="">
     <xsd:import namespace="71af3243-3dd4-4a8d-8c0d-dd76da1f02a5"/>
@@ -7463,19 +7424,7 @@
 </ct:contentTypeSchema>
 </file>
 
-<file path=customXml/item4.xml><?xml version="1.0" encoding="utf-8"?>
-<b:Sources xmlns:b="http://schemas.openxmlformats.org/officeDocument/2006/bibliography" xmlns="http://schemas.openxmlformats.org/officeDocument/2006/bibliography" SelectedStyle="\APASixthEditionOfficeOnline.xsl" StyleName="APA" Version="6"/>
-</file>
-
 <file path=customXml/itemProps1.xml><?xml version="1.0" encoding="utf-8"?>
-<ds:datastoreItem xmlns:ds="http://schemas.openxmlformats.org/officeDocument/2006/customXml" ds:itemID="{65FCD3D7-1163-4E1E-81D6-53884D80039F}">
-  <ds:schemaRefs>
-    <ds:schemaRef ds:uri="http://schemas.microsoft.com/sharepoint/v3/contenttype/forms"/>
-  </ds:schemaRefs>
-</ds:datastoreItem>
-</file>
-
-<file path=customXml/itemProps2.xml><?xml version="1.0" encoding="utf-8"?>
 <ds:datastoreItem xmlns:ds="http://schemas.openxmlformats.org/officeDocument/2006/customXml" ds:itemID="{FE811623-14C0-4B65-BDCD-F547A66C2951}">
   <ds:schemaRefs>
     <ds:schemaRef ds:uri="http://schemas.microsoft.com/office/2006/metadata/properties"/>
@@ -7485,7 +7434,23 @@
 </ds:datastoreItem>
 </file>
 
+<file path=customXml/itemProps2.xml><?xml version="1.0" encoding="utf-8"?>
+<ds:datastoreItem xmlns:ds="http://schemas.openxmlformats.org/officeDocument/2006/customXml" ds:itemID="{65FCD3D7-1163-4E1E-81D6-53884D80039F}">
+  <ds:schemaRefs>
+    <ds:schemaRef ds:uri="http://schemas.microsoft.com/sharepoint/v3/contenttype/forms"/>
+  </ds:schemaRefs>
+</ds:datastoreItem>
+</file>
+
 <file path=customXml/itemProps3.xml><?xml version="1.0" encoding="utf-8"?>
+<ds:datastoreItem xmlns:ds="http://schemas.openxmlformats.org/officeDocument/2006/customXml" ds:itemID="{A80CA8CC-DE4E-42AC-BF4B-381BD69ABC60}">
+  <ds:schemaRefs>
+    <ds:schemaRef ds:uri="http://schemas.openxmlformats.org/officeDocument/2006/bibliography"/>
+  </ds:schemaRefs>
+</ds:datastoreItem>
+</file>
+
+<file path=customXml/itemProps4.xml><?xml version="1.0" encoding="utf-8"?>
 <ds:datastoreItem xmlns:ds="http://schemas.openxmlformats.org/officeDocument/2006/customXml" ds:itemID="{9FCE161C-8AE6-4AA0-83B3-6CAA8E23BB0A}">
   <ds:schemaRefs>
     <ds:schemaRef ds:uri="http://schemas.microsoft.com/office/2006/metadata/contentType"/>
@@ -7502,12 +7467,4 @@
     <ds:schemaRef ds:uri="http://schemas.microsoft.com/internal/obd"/>
   </ds:schemaRefs>
 </ds:datastoreItem>
-</file>
-
-<file path=customXml/itemProps4.xml><?xml version="1.0" encoding="utf-8"?>
-<ds:datastoreItem xmlns:ds="http://schemas.openxmlformats.org/officeDocument/2006/customXml" ds:itemID="{A80CA8CC-DE4E-42AC-BF4B-381BD69ABC60}">
-  <ds:schemaRefs>
-    <ds:schemaRef ds:uri="http://schemas.openxmlformats.org/officeDocument/2006/bibliography"/>
-  </ds:schemaRefs>
-</ds:datastoreItem>
 </file>
</xml_diff>